<commit_message>
Output of cv and rechnung improved
</commit_message>
<xml_diff>
--- a/data/rechnung/Rechnung-Fuss.docx
+++ b/data/rechnung/Rechnung-Fuss.docx
@@ -14,36 +14,27 @@
     <w:p>
       <w:pPr>
         <w:rPr>
-          <w:rFonts w:ascii="Corbel" w:hAnsi="Corbel"/>
+          <w:rFonts w:asciiTheme="minorHAnsi" w:hAnsiTheme="minorHAnsi" w:cstheme="minorHAnsi"/>
+          <w:color w:val="auto"/>
           <w:spacing w:val="0"/>
-          <w:sz w:val="18"/>
-        </w:rPr>
-      </w:pPr>
-    </w:p>
-    <w:p>
-      <w:pPr>
-        <w:rPr>
-          <w:rFonts w:ascii="Corbel" w:hAnsi="Corbel"/>
-          <w:color w:val="767171" w:themeColor="background2" w:themeShade="80"/>
-          <w:spacing w:val="0"/>
-          <w:sz w:val="18"/>
+          <w:szCs w:val="20"/>
         </w:rPr>
       </w:pPr>
       <w:r>
         <w:rPr>
-          <w:rFonts w:ascii="Corbel" w:hAnsi="Corbel"/>
-          <w:color w:val="767171" w:themeColor="background2" w:themeShade="80"/>
+          <w:rFonts w:asciiTheme="minorHAnsi" w:hAnsiTheme="minorHAnsi" w:cstheme="minorHAnsi"/>
+          <w:color w:val="auto"/>
           <w:spacing w:val="0"/>
-          <w:sz w:val="18"/>
+          <w:szCs w:val="20"/>
         </w:rPr>
         <w:t>Mit freundlichen Grüßen</w:t>
       </w:r>
       <w:r>
         <w:rPr>
-          <w:rFonts w:ascii="Corbel" w:hAnsi="Corbel"/>
-          <w:color w:val="767171" w:themeColor="background2" w:themeShade="80"/>
+          <w:rFonts w:asciiTheme="minorHAnsi" w:hAnsiTheme="minorHAnsi" w:cstheme="minorHAnsi"/>
+          <w:color w:val="auto"/>
           <w:spacing w:val="0"/>
-          <w:sz w:val="18"/>
+          <w:szCs w:val="20"/>
         </w:rPr>
         <w:t>,</w:t>
       </w:r>
@@ -51,273 +42,34 @@
     <w:p>
       <w:pPr>
         <w:rPr>
-          <w:rFonts w:ascii="Corbel" w:hAnsi="Corbel"/>
-          <w:color w:val="767171" w:themeColor="background2" w:themeShade="80"/>
+          <w:rFonts w:asciiTheme="minorHAnsi" w:hAnsiTheme="minorHAnsi" w:cstheme="minorHAnsi"/>
+          <w:color w:val="auto"/>
           <w:spacing w:val="0"/>
-          <w:sz w:val="18"/>
+          <w:szCs w:val="20"/>
         </w:rPr>
       </w:pPr>
     </w:p>
     <w:p>
       <w:pPr>
         <w:rPr>
-          <w:rFonts w:ascii="Corbel" w:hAnsi="Corbel"/>
-          <w:color w:val="767171" w:themeColor="background2" w:themeShade="80"/>
-          <w:spacing w:val="0"/>
-          <w:sz w:val="18"/>
-        </w:rPr>
-      </w:pPr>
-    </w:p>
-    <w:p>
-      <w:pPr>
-        <w:rPr>
-          <w:rFonts w:ascii="Corbel" w:hAnsi="Corbel"/>
-          <w:color w:val="767171" w:themeColor="background2" w:themeShade="80"/>
-          <w:spacing w:val="0"/>
-          <w:sz w:val="18"/>
-        </w:rPr>
-      </w:pPr>
-    </w:p>
-    <w:p>
-      <w:pPr>
-        <w:rPr>
-          <w:rFonts w:ascii="Corbel" w:hAnsi="Corbel"/>
-          <w:color w:val="767171" w:themeColor="background2" w:themeShade="80"/>
-          <w:sz w:val="18"/>
+          <w:rFonts w:asciiTheme="minorHAnsi" w:hAnsiTheme="minorHAnsi" w:cstheme="minorHAnsi"/>
+          <w:color w:val="auto"/>
+          <w:szCs w:val="20"/>
         </w:rPr>
       </w:pPr>
       <w:r>
         <w:rPr>
-          <w:rFonts w:ascii="Corbel" w:hAnsi="Corbel"/>
-          <w:color w:val="767171" w:themeColor="background2" w:themeShade="80"/>
-          <w:sz w:val="18"/>
+          <w:rFonts w:asciiTheme="minorHAnsi" w:hAnsiTheme="minorHAnsi" w:cstheme="minorHAnsi"/>
+          <w:color w:val="auto"/>
+          <w:szCs w:val="20"/>
         </w:rPr>
         <w:t>Max Mustermann</w:t>
       </w:r>
     </w:p>
-    <w:p>
-      <w:pPr>
-        <w:rPr>
-          <w:rFonts w:ascii="Corbel" w:hAnsi="Corbel"/>
-          <w:color w:val="4C5B72"/>
-        </w:rPr>
-      </w:pPr>
-    </w:p>
-    <w:p>
-      <w:pPr>
-        <w:rPr>
-          <w:rFonts w:ascii="Corbel" w:hAnsi="Corbel"/>
-          <w:color w:val="4C5B72"/>
-        </w:rPr>
-      </w:pPr>
-    </w:p>
-    <w:p>
-      <w:pPr>
-        <w:rPr>
-          <w:rFonts w:ascii="Corbel" w:hAnsi="Corbel"/>
-          <w:color w:val="4C5B72"/>
-        </w:rPr>
-      </w:pPr>
-    </w:p>
-    <w:p>
-      <w:pPr>
-        <w:rPr>
-          <w:rFonts w:ascii="Corbel" w:hAnsi="Corbel"/>
-          <w:color w:val="4C5B72"/>
-        </w:rPr>
-      </w:pPr>
-    </w:p>
-    <w:p>
-      <w:pPr>
-        <w:rPr>
-          <w:rFonts w:ascii="Corbel" w:hAnsi="Corbel"/>
-          <w:color w:val="4C5B72"/>
-        </w:rPr>
-      </w:pPr>
-    </w:p>
-    <w:p>
-      <w:pPr>
-        <w:rPr>
-          <w:rFonts w:ascii="Corbel" w:hAnsi="Corbel"/>
-          <w:color w:val="4C5B72"/>
-        </w:rPr>
-      </w:pPr>
-    </w:p>
-    <w:p>
-      <w:pPr>
-        <w:rPr>
-          <w:rFonts w:ascii="Corbel" w:hAnsi="Corbel"/>
-          <w:color w:val="4C5B72"/>
-        </w:rPr>
-      </w:pPr>
-    </w:p>
-    <w:p>
-      <w:pPr>
-        <w:rPr>
-          <w:rFonts w:ascii="Corbel" w:hAnsi="Corbel"/>
-          <w:color w:val="4C5B72"/>
-        </w:rPr>
-      </w:pPr>
-    </w:p>
-    <w:p>
-      <w:pPr>
-        <w:rPr>
-          <w:rFonts w:ascii="Corbel" w:hAnsi="Corbel"/>
-          <w:color w:val="4C5B72"/>
-        </w:rPr>
-      </w:pPr>
-    </w:p>
-    <w:p>
-      <w:pPr>
-        <w:rPr>
-          <w:rFonts w:ascii="Corbel" w:hAnsi="Corbel"/>
-          <w:color w:val="4C5B72"/>
-        </w:rPr>
-      </w:pPr>
-    </w:p>
-    <w:p>
-      <w:pPr>
-        <w:rPr>
-          <w:rFonts w:ascii="Corbel" w:hAnsi="Corbel"/>
-          <w:color w:val="4C5B72"/>
-        </w:rPr>
-      </w:pPr>
-    </w:p>
-    <w:p>
-      <w:pPr>
-        <w:rPr>
-          <w:rFonts w:ascii="Corbel" w:hAnsi="Corbel"/>
-          <w:color w:val="4C5B72"/>
-        </w:rPr>
-      </w:pPr>
-    </w:p>
-    <w:p>
-      <w:pPr>
-        <w:rPr>
-          <w:rFonts w:ascii="Corbel" w:hAnsi="Corbel"/>
-          <w:color w:val="4C5B72"/>
-        </w:rPr>
-      </w:pPr>
-    </w:p>
-    <w:p>
-      <w:pPr>
-        <w:rPr>
-          <w:rFonts w:ascii="Corbel" w:hAnsi="Corbel"/>
-          <w:color w:val="4C5B72"/>
-        </w:rPr>
-      </w:pPr>
-    </w:p>
-    <w:p>
-      <w:pPr>
-        <w:rPr>
-          <w:rFonts w:ascii="Corbel" w:hAnsi="Corbel"/>
-          <w:color w:val="4C5B72"/>
-        </w:rPr>
-      </w:pPr>
-    </w:p>
-    <w:p>
-      <w:pPr>
-        <w:rPr>
-          <w:rFonts w:ascii="Corbel" w:hAnsi="Corbel"/>
-          <w:color w:val="4C5B72"/>
-        </w:rPr>
-      </w:pPr>
-    </w:p>
-    <w:p>
-      <w:pPr>
-        <w:rPr>
-          <w:rFonts w:ascii="Corbel" w:hAnsi="Corbel"/>
-          <w:color w:val="4C5B72"/>
-        </w:rPr>
-      </w:pPr>
-    </w:p>
-    <w:p>
-      <w:pPr>
-        <w:rPr>
-          <w:rFonts w:ascii="Corbel" w:hAnsi="Corbel"/>
-          <w:color w:val="4C5B72"/>
-        </w:rPr>
-      </w:pPr>
-    </w:p>
-    <w:p>
-      <w:pPr>
-        <w:rPr>
-          <w:rFonts w:ascii="Corbel" w:hAnsi="Corbel"/>
-          <w:color w:val="4C5B72"/>
-        </w:rPr>
-      </w:pPr>
-    </w:p>
-    <w:p>
-      <w:pPr>
-        <w:rPr>
-          <w:rFonts w:ascii="Corbel" w:hAnsi="Corbel"/>
-          <w:color w:val="4C5B72"/>
-        </w:rPr>
-      </w:pPr>
-    </w:p>
-    <w:p>
-      <w:pPr>
-        <w:rPr>
-          <w:rFonts w:ascii="Corbel" w:hAnsi="Corbel"/>
-          <w:color w:val="4C5B72"/>
-        </w:rPr>
-      </w:pPr>
-    </w:p>
-    <w:p>
-      <w:pPr>
-        <w:rPr>
-          <w:rFonts w:ascii="Corbel" w:hAnsi="Corbel"/>
-          <w:color w:val="4C5B72"/>
-        </w:rPr>
-      </w:pPr>
-    </w:p>
-    <w:p>
-      <w:pPr>
-        <w:rPr>
-          <w:rFonts w:ascii="Corbel" w:hAnsi="Corbel"/>
-          <w:color w:val="4C5B72"/>
-        </w:rPr>
-      </w:pPr>
-    </w:p>
-    <w:p>
-      <w:pPr>
-        <w:rPr>
-          <w:rFonts w:ascii="Corbel" w:hAnsi="Corbel"/>
-          <w:color w:val="4C5B72"/>
-        </w:rPr>
-      </w:pPr>
-    </w:p>
-    <w:p>
-      <w:pPr>
-        <w:rPr>
-          <w:rFonts w:ascii="Corbel" w:hAnsi="Corbel"/>
-          <w:color w:val="4C5B72"/>
-        </w:rPr>
-      </w:pPr>
-    </w:p>
-    <w:p>
-      <w:pPr>
-        <w:rPr>
-          <w:rFonts w:ascii="Corbel" w:hAnsi="Corbel"/>
-          <w:color w:val="4C5B72"/>
-        </w:rPr>
-      </w:pPr>
-    </w:p>
-    <w:p>
-      <w:pPr>
-        <w:rPr>
-          <w:rFonts w:ascii="Corbel" w:hAnsi="Corbel"/>
-          <w:color w:val="4C5B72"/>
-        </w:rPr>
-      </w:pPr>
-    </w:p>
     <w:sectPr>
-      <w:headerReference w:type="even" r:id="rId9"/>
-      <w:headerReference w:type="default" r:id="rId10"/>
-      <w:footerReference w:type="even" r:id="rId11"/>
-      <w:footerReference w:type="default" r:id="rId12"/>
-      <w:headerReference w:type="first" r:id="rId13"/>
-      <w:footerReference w:type="first" r:id="rId14"/>
+      <w:headerReference w:type="default" r:id="rId9"/>
+      <w:footerReference w:type="even" r:id="rId10"/>
+      <w:footerReference w:type="default" r:id="rId11"/>
       <w:pgSz w:w="11900" w:h="16840" w:code="9"/>
       <w:pgMar w:top="-3332" w:right="1134" w:bottom="284" w:left="1134" w:header="0" w:footer="284" w:gutter="0"/>
       <w:cols w:space="708"/>
@@ -481,569 +233,6 @@
 </w:ftr>
 </file>
 
-<file path=word/footer3.xml><?xml version="1.0" encoding="utf-8"?>
-<w:ftr xmlns:wpc="http://schemas.microsoft.com/office/word/2010/wordprocessingCanvas" xmlns:cx="http://schemas.microsoft.com/office/drawing/2014/chartex" xmlns:cx1="http://schemas.microsoft.com/office/drawing/2015/9/8/chartex" xmlns:cx2="http://schemas.microsoft.com/office/drawing/2015/10/21/chartex" xmlns:cx3="http://schemas.microsoft.com/office/drawing/2016/5/9/chartex" xmlns:cx4="http://schemas.microsoft.com/office/drawing/2016/5/10/chartex" xmlns:cx5="http://schemas.microsoft.com/office/drawing/2016/5/11/chartex" xmlns:cx6="http://schemas.microsoft.com/office/drawing/2016/5/12/chartex" xmlns:cx7="http://schemas.microsoft.com/office/drawing/2016/5/13/chartex" xmlns:cx8="http://schemas.microsoft.com/office/drawing/2016/5/14/chartex" xmlns:mc="http://schemas.openxmlformats.org/markup-compatibility/2006" xmlns:aink="http://schemas.microsoft.com/office/drawing/2016/ink" xmlns:am3d="http://schemas.microsoft.com/office/drawing/2017/model3d" xmlns:o="urn:schemas-microsoft-com:office:office" xmlns:oel="http://schemas.microsoft.com/office/2019/extlst" xmlns:r="http://schemas.openxmlformats.org/officeDocument/2006/relationships" xmlns:m="http://schemas.openxmlformats.org/officeDocument/2006/math" xmlns:v="urn:schemas-microsoft-com:vml" xmlns:wp14="http://schemas.microsoft.com/office/word/2010/wordprocessingDrawing" xmlns:wp="http://schemas.openxmlformats.org/drawingml/2006/wordprocessingDrawing" xmlns:w10="urn:schemas-microsoft-com:office:word" xmlns:w="http://schemas.openxmlformats.org/wordprocessingml/2006/main" xmlns:w14="http://schemas.microsoft.com/office/word/2010/wordml" xmlns:w15="http://schemas.microsoft.com/office/word/2012/wordml" xmlns:w16cex="http://schemas.microsoft.com/office/word/2018/wordml/cex" xmlns:w16cid="http://schemas.microsoft.com/office/word/2016/wordml/cid" xmlns:w16="http://schemas.microsoft.com/office/word/2018/wordml" xmlns:w16du="http://schemas.microsoft.com/office/word/2023/wordml/word16du" xmlns:w16sdtdh="http://schemas.microsoft.com/office/word/2020/wordml/sdtdatahash" xmlns:w16sdtfl="http://schemas.microsoft.com/office/word/2024/wordml/sdtformatlock" xmlns:w16se="http://schemas.microsoft.com/office/word/2015/wordml/symex" xmlns:wpg="http://schemas.microsoft.com/office/word/2010/wordprocessingGroup" xmlns:wpi="http://schemas.microsoft.com/office/word/2010/wordprocessingInk" xmlns:wne="http://schemas.microsoft.com/office/word/2006/wordml" xmlns:wps="http://schemas.microsoft.com/office/word/2010/wordprocessingShape" mc:Ignorable="w14 w15 w16se w16cid w16 w16cex w16sdtdh w16sdtfl w16du wp14">
-  <w:p>
-    <w:pPr>
-      <w:pStyle w:val="Fuzeile"/>
-    </w:pPr>
-    <w:r>
-      <w:rPr>
-        <w:noProof/>
-      </w:rPr>
-      <mc:AlternateContent>
-        <mc:Choice Requires="wps">
-          <w:drawing>
-            <wp:anchor distT="0" distB="0" distL="114300" distR="114300" simplePos="0" relativeHeight="251670528" behindDoc="0" locked="0" layoutInCell="1" allowOverlap="1" wp14:anchorId="46504A67" wp14:editId="5DD84DE6">
-              <wp:simplePos x="0" y="0"/>
-              <wp:positionH relativeFrom="column">
-                <wp:posOffset>-737870</wp:posOffset>
-              </wp:positionH>
-              <wp:positionV relativeFrom="paragraph">
-                <wp:posOffset>-369645</wp:posOffset>
-              </wp:positionV>
-              <wp:extent cx="7559040" cy="545577"/>
-              <wp:effectExtent l="0" t="0" r="0" b="635"/>
-              <wp:wrapNone/>
-              <wp:docPr id="1815795415" name="Textfeld 3"/>
-              <wp:cNvGraphicFramePr/>
-              <a:graphic xmlns:a="http://schemas.openxmlformats.org/drawingml/2006/main">
-                <a:graphicData uri="http://schemas.microsoft.com/office/word/2010/wordprocessingShape">
-                  <wps:wsp>
-                    <wps:cNvSpPr txBox="1"/>
-                    <wps:spPr>
-                      <a:xfrm>
-                        <a:off x="0" y="0"/>
-                        <a:ext cx="7559040" cy="545577"/>
-                      </a:xfrm>
-                      <a:prstGeom prst="rect">
-                        <a:avLst/>
-                      </a:prstGeom>
-                      <a:solidFill>
-                        <a:schemeClr val="lt1"/>
-                      </a:solidFill>
-                      <a:ln w="6350">
-                        <a:noFill/>
-                      </a:ln>
-                    </wps:spPr>
-                    <wps:txbx>
-                      <w:txbxContent>
-                        <w:p>
-                          <w:pPr>
-                            <w:jc w:val="center"/>
-                            <w:rPr>
-                              <w:rFonts w:ascii="Corbel" w:hAnsi="Corbel"/>
-                            </w:rPr>
-                          </w:pPr>
-                          <w:r>
-                            <w:rPr>
-                              <w:rFonts w:ascii="Corbel" w:hAnsi="Corbel"/>
-                            </w:rPr>
-                            <w:t xml:space="preserve">Adresse: Musterstraße 15 </w:t>
-                          </w:r>
-                          <w:r>
-                            <w:rPr>
-                              <w:rFonts w:ascii="Corbel" w:hAnsi="Corbel"/>
-                              <w:sz w:val="15"/>
-                              <w:szCs w:val="15"/>
-                            </w:rPr>
-                            <w:t>•</w:t>
-                          </w:r>
-                          <w:r>
-                            <w:rPr>
-                              <w:rFonts w:ascii="Corbel" w:hAnsi="Corbel"/>
-                            </w:rPr>
-                            <w:t xml:space="preserve"> 20146 Hamburg </w:t>
-                          </w:r>
-                          <w:r>
-                            <w:rPr>
-                              <w:rFonts w:ascii="Corbel" w:hAnsi="Corbel"/>
-                              <w:sz w:val="15"/>
-                              <w:szCs w:val="15"/>
-                            </w:rPr>
-                            <w:t>•</w:t>
-                          </w:r>
-                          <w:r>
-                            <w:rPr>
-                              <w:rFonts w:ascii="Corbel" w:hAnsi="Corbel"/>
-                            </w:rPr>
-                            <w:t xml:space="preserve"> Tel.: 040 00 00 000 </w:t>
-                          </w:r>
-                          <w:r>
-                            <w:rPr>
-                              <w:rFonts w:ascii="Corbel" w:hAnsi="Corbel"/>
-                              <w:sz w:val="15"/>
-                              <w:szCs w:val="15"/>
-                            </w:rPr>
-                            <w:t>•</w:t>
-                          </w:r>
-                          <w:r>
-                            <w:rPr>
-                              <w:rFonts w:ascii="Corbel" w:hAnsi="Corbel"/>
-                            </w:rPr>
-                            <w:t xml:space="preserve"> </w:t>
-                          </w:r>
-                          <w:r>
-                            <w:rPr>
-                              <w:rFonts w:ascii="Corbel" w:hAnsi="Corbel"/>
-                            </w:rPr>
-                            <w:t>Max Mustermann</w:t>
-                          </w:r>
-                          <w:r>
-                            <w:rPr>
-                              <w:rFonts w:ascii="Corbel" w:hAnsi="Corbel"/>
-                            </w:rPr>
-                            <w:t>@</w:t>
-                          </w:r>
-                          <w:r>
-                            <w:rPr>
-                              <w:rFonts w:ascii="Corbel" w:hAnsi="Corbel"/>
-                            </w:rPr>
-                            <w:t>web</w:t>
-                          </w:r>
-                          <w:r>
-                            <w:rPr>
-                              <w:rFonts w:ascii="Corbel" w:hAnsi="Corbel"/>
-                            </w:rPr>
-                            <w:t>.de</w:t>
-                          </w:r>
-                          <w:r>
-                            <w:rPr>
-                              <w:rFonts w:ascii="Corbel" w:hAnsi="Corbel"/>
-                            </w:rPr>
-                            <w:br/>
-                          </w:r>
-                          <w:r>
-                            <w:rPr>
-                              <w:rFonts w:ascii="Corbel" w:hAnsi="Corbel"/>
-                            </w:rPr>
-                            <w:t xml:space="preserve">St.-Nr.: </w:t>
-                          </w:r>
-                          <w:r>
-                            <w:rPr>
-                              <w:rFonts w:ascii="Corbel" w:hAnsi="Corbel"/>
-                            </w:rPr>
-                            <w:t>00</w:t>
-                          </w:r>
-                          <w:r>
-                            <w:rPr>
-                              <w:rFonts w:ascii="Corbel" w:hAnsi="Corbel"/>
-                            </w:rPr>
-                            <w:t>/</w:t>
-                          </w:r>
-                          <w:r>
-                            <w:rPr>
-                              <w:rFonts w:ascii="Corbel" w:hAnsi="Corbel"/>
-                            </w:rPr>
-                            <w:t>0</w:t>
-                          </w:r>
-                          <w:r>
-                            <w:rPr>
-                              <w:rFonts w:ascii="Corbel" w:hAnsi="Corbel"/>
-                            </w:rPr>
-                            <w:t>0</w:t>
-                          </w:r>
-                          <w:r>
-                            <w:rPr>
-                              <w:rFonts w:ascii="Corbel" w:hAnsi="Corbel"/>
-                            </w:rPr>
-                            <w:t>0</w:t>
-                          </w:r>
-                          <w:r>
-                            <w:rPr>
-                              <w:rFonts w:ascii="Corbel" w:hAnsi="Corbel"/>
-                            </w:rPr>
-                            <w:t>/0</w:t>
-                          </w:r>
-                          <w:r>
-                            <w:rPr>
-                              <w:rFonts w:ascii="Corbel" w:hAnsi="Corbel"/>
-                            </w:rPr>
-                            <w:t xml:space="preserve">0000 </w:t>
-                          </w:r>
-                          <w:r>
-                            <w:rPr>
-                              <w:rFonts w:ascii="Corbel" w:hAnsi="Corbel"/>
-                              <w:sz w:val="15"/>
-                              <w:szCs w:val="15"/>
-                            </w:rPr>
-                            <w:t>•</w:t>
-                          </w:r>
-                          <w:r>
-                            <w:rPr>
-                              <w:rFonts w:ascii="Corbel" w:hAnsi="Corbel"/>
-                            </w:rPr>
-                            <w:t xml:space="preserve"> </w:t>
-                          </w:r>
-                          <w:proofErr w:type="spellStart"/>
-                          <w:r>
-                            <w:rPr>
-                              <w:rFonts w:ascii="Corbel" w:hAnsi="Corbel"/>
-                            </w:rPr>
-                            <w:t>USt_IdNr</w:t>
-                          </w:r>
-                          <w:proofErr w:type="spellEnd"/>
-                          <w:r>
-                            <w:rPr>
-                              <w:rFonts w:ascii="Corbel" w:hAnsi="Corbel"/>
-                            </w:rPr>
-                            <w:t>.: DE</w:t>
-                          </w:r>
-                          <w:r>
-                            <w:rPr>
-                              <w:rFonts w:ascii="Corbel" w:hAnsi="Corbel"/>
-                            </w:rPr>
-                            <w:t xml:space="preserve">0000000000 </w:t>
-                          </w:r>
-                          <w:r>
-                            <w:rPr>
-                              <w:rFonts w:ascii="Corbel" w:hAnsi="Corbel"/>
-                              <w:sz w:val="15"/>
-                              <w:szCs w:val="15"/>
-                            </w:rPr>
-                            <w:t>•</w:t>
-                          </w:r>
-                          <w:r>
-                            <w:rPr>
-                              <w:rFonts w:ascii="Corbel" w:hAnsi="Corbel"/>
-                            </w:rPr>
-                            <w:t xml:space="preserve"> </w:t>
-                          </w:r>
-                          <w:r>
-                            <w:rPr>
-                              <w:rFonts w:ascii="Corbel" w:hAnsi="Corbel"/>
-                            </w:rPr>
-                            <w:t>Commerzbank</w:t>
-                          </w:r>
-                          <w:r>
-                            <w:rPr>
-                              <w:rFonts w:ascii="Corbel" w:hAnsi="Corbel"/>
-                            </w:rPr>
-                            <w:t xml:space="preserve"> </w:t>
-                          </w:r>
-                          <w:r>
-                            <w:rPr>
-                              <w:rFonts w:ascii="Corbel" w:hAnsi="Corbel"/>
-                            </w:rPr>
-                            <w:t>IBAN: DE</w:t>
-                          </w:r>
-                          <w:r>
-                            <w:rPr>
-                              <w:rFonts w:ascii="Corbel" w:hAnsi="Corbel"/>
-                            </w:rPr>
-                            <w:t>000000</w:t>
-                          </w:r>
-                          <w:r>
-                            <w:rPr>
-                              <w:rFonts w:ascii="Corbel" w:hAnsi="Corbel"/>
-                            </w:rPr>
-                            <w:t>00</w:t>
-                          </w:r>
-                          <w:r>
-                            <w:rPr>
-                              <w:rFonts w:ascii="Corbel" w:hAnsi="Corbel"/>
-                            </w:rPr>
-                            <w:t>00</w:t>
-                          </w:r>
-                          <w:r>
-                            <w:rPr>
-                              <w:rFonts w:ascii="Corbel" w:hAnsi="Corbel"/>
-                            </w:rPr>
-                            <w:t>0</w:t>
-                          </w:r>
-                          <w:r>
-                            <w:rPr>
-                              <w:rFonts w:ascii="Corbel" w:hAnsi="Corbel"/>
-                            </w:rPr>
-                            <w:t>0</w:t>
-                          </w:r>
-                          <w:r>
-                            <w:rPr>
-                              <w:rFonts w:ascii="Corbel" w:hAnsi="Corbel"/>
-                            </w:rPr>
-                            <w:t>00</w:t>
-                          </w:r>
-                          <w:r>
-                            <w:rPr>
-                              <w:rFonts w:ascii="Corbel" w:hAnsi="Corbel"/>
-                            </w:rPr>
-                            <w:t>000000</w:t>
-                          </w:r>
-                        </w:p>
-                      </w:txbxContent>
-                    </wps:txbx>
-                    <wps:bodyPr rot="0" spcFirstLastPara="0" vertOverflow="overflow" horzOverflow="overflow" vert="horz" wrap="square" lIns="91440" tIns="45720" rIns="91440" bIns="45720" numCol="1" spcCol="0" rtlCol="0" fromWordArt="0" anchor="t" anchorCtr="0" forceAA="0" compatLnSpc="1">
-                      <a:prstTxWarp prst="textNoShape">
-                        <a:avLst/>
-                      </a:prstTxWarp>
-                      <a:noAutofit/>
-                    </wps:bodyPr>
-                  </wps:wsp>
-                </a:graphicData>
-              </a:graphic>
-              <wp14:sizeRelH relativeFrom="margin">
-                <wp14:pctWidth>0</wp14:pctWidth>
-              </wp14:sizeRelH>
-              <wp14:sizeRelV relativeFrom="margin">
-                <wp14:pctHeight>0</wp14:pctHeight>
-              </wp14:sizeRelV>
-            </wp:anchor>
-          </w:drawing>
-        </mc:Choice>
-        <mc:Fallback>
-          <w:pict>
-            <v:shapetype w14:anchorId="46504A67" id="_x0000_t202" coordsize="21600,21600" o:spt="202" path="m,l,21600r21600,l21600,xe">
-              <v:stroke joinstyle="miter"/>
-              <v:path gradientshapeok="t" o:connecttype="rect"/>
-            </v:shapetype>
-            <v:shape id="Textfeld 3" o:spid="_x0000_s1028" type="#_x0000_t202" style="position:absolute;left:0;text-align:left;margin-left:-58.1pt;margin-top:-29.1pt;width:595.2pt;height:42.95pt;z-index:251670528;visibility:visible;mso-wrap-style:square;mso-width-percent:0;mso-height-percent:0;mso-wrap-distance-left:9pt;mso-wrap-distance-top:0;mso-wrap-distance-right:9pt;mso-wrap-distance-bottom:0;mso-position-horizontal:absolute;mso-position-horizontal-relative:text;mso-position-vertical:absolute;mso-position-vertical-relative:text;mso-width-percent:0;mso-height-percent:0;mso-width-relative:margin;mso-height-relative:margin;v-text-anchor:top" o:gfxdata="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" fillcolor="white [3201]" stroked="f" strokeweight=".5pt">
-              <v:textbox>
-                <w:txbxContent>
-                  <w:p>
-                    <w:pPr>
-                      <w:jc w:val="center"/>
-                      <w:rPr>
-                        <w:rFonts w:ascii="Corbel" w:hAnsi="Corbel"/>
-                      </w:rPr>
-                    </w:pPr>
-                    <w:r>
-                      <w:rPr>
-                        <w:rFonts w:ascii="Corbel" w:hAnsi="Corbel"/>
-                      </w:rPr>
-                      <w:t xml:space="preserve">Adresse: Musterstraße 15 </w:t>
-                    </w:r>
-                    <w:r>
-                      <w:rPr>
-                        <w:rFonts w:ascii="Corbel" w:hAnsi="Corbel"/>
-                        <w:sz w:val="15"/>
-                        <w:szCs w:val="15"/>
-                      </w:rPr>
-                      <w:t>•</w:t>
-                    </w:r>
-                    <w:r>
-                      <w:rPr>
-                        <w:rFonts w:ascii="Corbel" w:hAnsi="Corbel"/>
-                      </w:rPr>
-                      <w:t xml:space="preserve"> 20146 Hamburg </w:t>
-                    </w:r>
-                    <w:r>
-                      <w:rPr>
-                        <w:rFonts w:ascii="Corbel" w:hAnsi="Corbel"/>
-                        <w:sz w:val="15"/>
-                        <w:szCs w:val="15"/>
-                      </w:rPr>
-                      <w:t>•</w:t>
-                    </w:r>
-                    <w:r>
-                      <w:rPr>
-                        <w:rFonts w:ascii="Corbel" w:hAnsi="Corbel"/>
-                      </w:rPr>
-                      <w:t xml:space="preserve"> Tel.: 040 00 00 000 </w:t>
-                    </w:r>
-                    <w:r>
-                      <w:rPr>
-                        <w:rFonts w:ascii="Corbel" w:hAnsi="Corbel"/>
-                        <w:sz w:val="15"/>
-                        <w:szCs w:val="15"/>
-                      </w:rPr>
-                      <w:t>•</w:t>
-                    </w:r>
-                    <w:r>
-                      <w:rPr>
-                        <w:rFonts w:ascii="Corbel" w:hAnsi="Corbel"/>
-                      </w:rPr>
-                      <w:t xml:space="preserve"> </w:t>
-                    </w:r>
-                    <w:r>
-                      <w:rPr>
-                        <w:rFonts w:ascii="Corbel" w:hAnsi="Corbel"/>
-                      </w:rPr>
-                      <w:t>Max Mustermann</w:t>
-                    </w:r>
-                    <w:r>
-                      <w:rPr>
-                        <w:rFonts w:ascii="Corbel" w:hAnsi="Corbel"/>
-                      </w:rPr>
-                      <w:t>@</w:t>
-                    </w:r>
-                    <w:r>
-                      <w:rPr>
-                        <w:rFonts w:ascii="Corbel" w:hAnsi="Corbel"/>
-                      </w:rPr>
-                      <w:t>web</w:t>
-                    </w:r>
-                    <w:r>
-                      <w:rPr>
-                        <w:rFonts w:ascii="Corbel" w:hAnsi="Corbel"/>
-                      </w:rPr>
-                      <w:t>.de</w:t>
-                    </w:r>
-                    <w:r>
-                      <w:rPr>
-                        <w:rFonts w:ascii="Corbel" w:hAnsi="Corbel"/>
-                      </w:rPr>
-                      <w:br/>
-                    </w:r>
-                    <w:r>
-                      <w:rPr>
-                        <w:rFonts w:ascii="Corbel" w:hAnsi="Corbel"/>
-                      </w:rPr>
-                      <w:t xml:space="preserve">St.-Nr.: </w:t>
-                    </w:r>
-                    <w:r>
-                      <w:rPr>
-                        <w:rFonts w:ascii="Corbel" w:hAnsi="Corbel"/>
-                      </w:rPr>
-                      <w:t>00</w:t>
-                    </w:r>
-                    <w:r>
-                      <w:rPr>
-                        <w:rFonts w:ascii="Corbel" w:hAnsi="Corbel"/>
-                      </w:rPr>
-                      <w:t>/</w:t>
-                    </w:r>
-                    <w:r>
-                      <w:rPr>
-                        <w:rFonts w:ascii="Corbel" w:hAnsi="Corbel"/>
-                      </w:rPr>
-                      <w:t>0</w:t>
-                    </w:r>
-                    <w:r>
-                      <w:rPr>
-                        <w:rFonts w:ascii="Corbel" w:hAnsi="Corbel"/>
-                      </w:rPr>
-                      <w:t>0</w:t>
-                    </w:r>
-                    <w:r>
-                      <w:rPr>
-                        <w:rFonts w:ascii="Corbel" w:hAnsi="Corbel"/>
-                      </w:rPr>
-                      <w:t>0</w:t>
-                    </w:r>
-                    <w:r>
-                      <w:rPr>
-                        <w:rFonts w:ascii="Corbel" w:hAnsi="Corbel"/>
-                      </w:rPr>
-                      <w:t>/0</w:t>
-                    </w:r>
-                    <w:r>
-                      <w:rPr>
-                        <w:rFonts w:ascii="Corbel" w:hAnsi="Corbel"/>
-                      </w:rPr>
-                      <w:t xml:space="preserve">0000 </w:t>
-                    </w:r>
-                    <w:r>
-                      <w:rPr>
-                        <w:rFonts w:ascii="Corbel" w:hAnsi="Corbel"/>
-                        <w:sz w:val="15"/>
-                        <w:szCs w:val="15"/>
-                      </w:rPr>
-                      <w:t>•</w:t>
-                    </w:r>
-                    <w:r>
-                      <w:rPr>
-                        <w:rFonts w:ascii="Corbel" w:hAnsi="Corbel"/>
-                      </w:rPr>
-                      <w:t xml:space="preserve"> </w:t>
-                    </w:r>
-                    <w:r>
-                      <w:rPr>
-                        <w:rFonts w:ascii="Corbel" w:hAnsi="Corbel"/>
-                      </w:rPr>
-                      <w:t>USt_IdNr.: DE</w:t>
-                    </w:r>
-                    <w:r>
-                      <w:rPr>
-                        <w:rFonts w:ascii="Corbel" w:hAnsi="Corbel"/>
-                      </w:rPr>
-                      <w:t xml:space="preserve">0000000000 </w:t>
-                    </w:r>
-                    <w:r>
-                      <w:rPr>
-                        <w:rFonts w:ascii="Corbel" w:hAnsi="Corbel"/>
-                        <w:sz w:val="15"/>
-                        <w:szCs w:val="15"/>
-                      </w:rPr>
-                      <w:t>•</w:t>
-                    </w:r>
-                    <w:r>
-                      <w:rPr>
-                        <w:rFonts w:ascii="Corbel" w:hAnsi="Corbel"/>
-                      </w:rPr>
-                      <w:t xml:space="preserve"> </w:t>
-                    </w:r>
-                    <w:r>
-                      <w:rPr>
-                        <w:rFonts w:ascii="Corbel" w:hAnsi="Corbel"/>
-                      </w:rPr>
-                      <w:t>Commerzbank</w:t>
-                    </w:r>
-                    <w:r>
-                      <w:rPr>
-                        <w:rFonts w:ascii="Corbel" w:hAnsi="Corbel"/>
-                      </w:rPr>
-                      <w:t xml:space="preserve"> </w:t>
-                    </w:r>
-                    <w:r>
-                      <w:rPr>
-                        <w:rFonts w:ascii="Corbel" w:hAnsi="Corbel"/>
-                      </w:rPr>
-                      <w:t>IBAN: DE</w:t>
-                    </w:r>
-                    <w:r>
-                      <w:rPr>
-                        <w:rFonts w:ascii="Corbel" w:hAnsi="Corbel"/>
-                      </w:rPr>
-                      <w:t>000000</w:t>
-                    </w:r>
-                    <w:r>
-                      <w:rPr>
-                        <w:rFonts w:ascii="Corbel" w:hAnsi="Corbel"/>
-                      </w:rPr>
-                      <w:t>00</w:t>
-                    </w:r>
-                    <w:r>
-                      <w:rPr>
-                        <w:rFonts w:ascii="Corbel" w:hAnsi="Corbel"/>
-                      </w:rPr>
-                      <w:t>00</w:t>
-                    </w:r>
-                    <w:r>
-                      <w:rPr>
-                        <w:rFonts w:ascii="Corbel" w:hAnsi="Corbel"/>
-                      </w:rPr>
-                      <w:t>0</w:t>
-                    </w:r>
-                    <w:r>
-                      <w:rPr>
-                        <w:rFonts w:ascii="Corbel" w:hAnsi="Corbel"/>
-                      </w:rPr>
-                      <w:t>0</w:t>
-                    </w:r>
-                    <w:r>
-                      <w:rPr>
-                        <w:rFonts w:ascii="Corbel" w:hAnsi="Corbel"/>
-                      </w:rPr>
-                      <w:t>00</w:t>
-                    </w:r>
-                    <w:r>
-                      <w:rPr>
-                        <w:rFonts w:ascii="Corbel" w:hAnsi="Corbel"/>
-                      </w:rPr>
-                      <w:t>000000</w:t>
-                    </w:r>
-                  </w:p>
-                </w:txbxContent>
-              </v:textbox>
-            </v:shape>
-          </w:pict>
-        </mc:Fallback>
-      </mc:AlternateContent>
-    </w:r>
-  </w:p>
-</w:ftr>
-</file>
-
 <file path=word/footnotes.xml><?xml version="1.0" encoding="utf-8"?>
 <w:footnotes xmlns:wpc="http://schemas.microsoft.com/office/word/2010/wordprocessingCanvas" xmlns:cx="http://schemas.microsoft.com/office/drawing/2014/chartex" xmlns:cx1="http://schemas.microsoft.com/office/drawing/2015/9/8/chartex" xmlns:cx2="http://schemas.microsoft.com/office/drawing/2015/10/21/chartex" xmlns:cx3="http://schemas.microsoft.com/office/drawing/2016/5/9/chartex" xmlns:cx4="http://schemas.microsoft.com/office/drawing/2016/5/10/chartex" xmlns:cx5="http://schemas.microsoft.com/office/drawing/2016/5/11/chartex" xmlns:cx6="http://schemas.microsoft.com/office/drawing/2016/5/12/chartex" xmlns:cx7="http://schemas.microsoft.com/office/drawing/2016/5/13/chartex" xmlns:cx8="http://schemas.microsoft.com/office/drawing/2016/5/14/chartex" xmlns:mc="http://schemas.openxmlformats.org/markup-compatibility/2006" xmlns:aink="http://schemas.microsoft.com/office/drawing/2016/ink" xmlns:am3d="http://schemas.microsoft.com/office/drawing/2017/model3d" xmlns:o="urn:schemas-microsoft-com:office:office" xmlns:oel="http://schemas.microsoft.com/office/2019/extlst" xmlns:r="http://schemas.openxmlformats.org/officeDocument/2006/relationships" xmlns:m="http://schemas.openxmlformats.org/officeDocument/2006/math" xmlns:v="urn:schemas-microsoft-com:vml" xmlns:wp14="http://schemas.microsoft.com/office/word/2010/wordprocessingDrawing" xmlns:wp="http://schemas.openxmlformats.org/drawingml/2006/wordprocessingDrawing" xmlns:w10="urn:schemas-microsoft-com:office:word" xmlns:w="http://schemas.openxmlformats.org/wordprocessingml/2006/main" xmlns:w14="http://schemas.microsoft.com/office/word/2010/wordml" xmlns:w15="http://schemas.microsoft.com/office/word/2012/wordml" xmlns:w16cex="http://schemas.microsoft.com/office/word/2018/wordml/cex" xmlns:w16cid="http://schemas.microsoft.com/office/word/2016/wordml/cid" xmlns:w16="http://schemas.microsoft.com/office/word/2018/wordml" xmlns:w16du="http://schemas.microsoft.com/office/word/2023/wordml/word16du" xmlns:w16sdtdh="http://schemas.microsoft.com/office/word/2020/wordml/sdtdatahash" xmlns:w16sdtfl="http://schemas.microsoft.com/office/word/2024/wordml/sdtformatlock" xmlns:w16se="http://schemas.microsoft.com/office/word/2015/wordml/symex" xmlns:wpg="http://schemas.microsoft.com/office/word/2010/wordprocessingGroup" xmlns:wpi="http://schemas.microsoft.com/office/word/2010/wordprocessingInk" xmlns:wne="http://schemas.microsoft.com/office/word/2006/wordml" xmlns:wps="http://schemas.microsoft.com/office/word/2010/wordprocessingShape" mc:Ignorable="w14 w15 w16se w16cid w16 w16cex w16sdtdh w16sdtfl w16du wp14">
   <w:footnote w:type="separator" w:id="-1">
@@ -1064,16 +253,6 @@
 </file>
 
 <file path=word/header1.xml><?xml version="1.0" encoding="utf-8"?>
-<w:hdr xmlns:wpc="http://schemas.microsoft.com/office/word/2010/wordprocessingCanvas" xmlns:cx="http://schemas.microsoft.com/office/drawing/2014/chartex" xmlns:cx1="http://schemas.microsoft.com/office/drawing/2015/9/8/chartex" xmlns:cx2="http://schemas.microsoft.com/office/drawing/2015/10/21/chartex" xmlns:cx3="http://schemas.microsoft.com/office/drawing/2016/5/9/chartex" xmlns:cx4="http://schemas.microsoft.com/office/drawing/2016/5/10/chartex" xmlns:cx5="http://schemas.microsoft.com/office/drawing/2016/5/11/chartex" xmlns:cx6="http://schemas.microsoft.com/office/drawing/2016/5/12/chartex" xmlns:cx7="http://schemas.microsoft.com/office/drawing/2016/5/13/chartex" xmlns:cx8="http://schemas.microsoft.com/office/drawing/2016/5/14/chartex" xmlns:mc="http://schemas.openxmlformats.org/markup-compatibility/2006" xmlns:aink="http://schemas.microsoft.com/office/drawing/2016/ink" xmlns:am3d="http://schemas.microsoft.com/office/drawing/2017/model3d" xmlns:o="urn:schemas-microsoft-com:office:office" xmlns:oel="http://schemas.microsoft.com/office/2019/extlst" xmlns:r="http://schemas.openxmlformats.org/officeDocument/2006/relationships" xmlns:m="http://schemas.openxmlformats.org/officeDocument/2006/math" xmlns:v="urn:schemas-microsoft-com:vml" xmlns:wp14="http://schemas.microsoft.com/office/word/2010/wordprocessingDrawing" xmlns:wp="http://schemas.openxmlformats.org/drawingml/2006/wordprocessingDrawing" xmlns:w10="urn:schemas-microsoft-com:office:word" xmlns:w="http://schemas.openxmlformats.org/wordprocessingml/2006/main" xmlns:w14="http://schemas.microsoft.com/office/word/2010/wordml" xmlns:w15="http://schemas.microsoft.com/office/word/2012/wordml" xmlns:w16cex="http://schemas.microsoft.com/office/word/2018/wordml/cex" xmlns:w16cid="http://schemas.microsoft.com/office/word/2016/wordml/cid" xmlns:w16="http://schemas.microsoft.com/office/word/2018/wordml" xmlns:w16du="http://schemas.microsoft.com/office/word/2023/wordml/word16du" xmlns:w16sdtdh="http://schemas.microsoft.com/office/word/2020/wordml/sdtdatahash" xmlns:w16sdtfl="http://schemas.microsoft.com/office/word/2024/wordml/sdtformatlock" xmlns:w16se="http://schemas.microsoft.com/office/word/2015/wordml/symex" xmlns:wpg="http://schemas.microsoft.com/office/word/2010/wordprocessingGroup" xmlns:wpi="http://schemas.microsoft.com/office/word/2010/wordprocessingInk" xmlns:wne="http://schemas.microsoft.com/office/word/2006/wordml" xmlns:wps="http://schemas.microsoft.com/office/word/2010/wordprocessingShape" mc:Ignorable="w14 w15 w16se w16cid w16 w16cex w16sdtdh w16sdtfl w16du wp14">
-  <w:p>
-    <w:pPr>
-      <w:pStyle w:val="Kopfzeile"/>
-    </w:pPr>
-  </w:p>
-</w:hdr>
-</file>
-
-<file path=word/header2.xml><?xml version="1.0" encoding="utf-8"?>
 <w:hdr xmlns:wpc="http://schemas.microsoft.com/office/word/2010/wordprocessingCanvas" xmlns:cx="http://schemas.microsoft.com/office/drawing/2014/chartex" xmlns:cx1="http://schemas.microsoft.com/office/drawing/2015/9/8/chartex" xmlns:cx2="http://schemas.microsoft.com/office/drawing/2015/10/21/chartex" xmlns:cx3="http://schemas.microsoft.com/office/drawing/2016/5/9/chartex" xmlns:cx4="http://schemas.microsoft.com/office/drawing/2016/5/10/chartex" xmlns:cx5="http://schemas.microsoft.com/office/drawing/2016/5/11/chartex" xmlns:cx6="http://schemas.microsoft.com/office/drawing/2016/5/12/chartex" xmlns:cx7="http://schemas.microsoft.com/office/drawing/2016/5/13/chartex" xmlns:cx8="http://schemas.microsoft.com/office/drawing/2016/5/14/chartex" xmlns:mc="http://schemas.openxmlformats.org/markup-compatibility/2006" xmlns:aink="http://schemas.microsoft.com/office/drawing/2016/ink" xmlns:am3d="http://schemas.microsoft.com/office/drawing/2017/model3d" xmlns:o="urn:schemas-microsoft-com:office:office" xmlns:oel="http://schemas.microsoft.com/office/2019/extlst" xmlns:r="http://schemas.openxmlformats.org/officeDocument/2006/relationships" xmlns:m="http://schemas.openxmlformats.org/officeDocument/2006/math" xmlns:v="urn:schemas-microsoft-com:vml" xmlns:wp14="http://schemas.microsoft.com/office/word/2010/wordprocessingDrawing" xmlns:wp="http://schemas.openxmlformats.org/drawingml/2006/wordprocessingDrawing" xmlns:w10="urn:schemas-microsoft-com:office:word" xmlns:w="http://schemas.openxmlformats.org/wordprocessingml/2006/main" xmlns:w14="http://schemas.microsoft.com/office/word/2010/wordml" xmlns:w15="http://schemas.microsoft.com/office/word/2012/wordml" xmlns:w16cex="http://schemas.microsoft.com/office/word/2018/wordml/cex" xmlns:w16cid="http://schemas.microsoft.com/office/word/2016/wordml/cid" xmlns:w16="http://schemas.microsoft.com/office/word/2018/wordml" xmlns:w16du="http://schemas.microsoft.com/office/word/2023/wordml/word16du" xmlns:w16sdtdh="http://schemas.microsoft.com/office/word/2020/wordml/sdtdatahash" xmlns:w16sdtfl="http://schemas.microsoft.com/office/word/2024/wordml/sdtformatlock" xmlns:w16se="http://schemas.microsoft.com/office/word/2015/wordml/symex" xmlns:wpg="http://schemas.microsoft.com/office/word/2010/wordprocessingGroup" xmlns:wpi="http://schemas.microsoft.com/office/word/2010/wordprocessingInk" xmlns:wne="http://schemas.microsoft.com/office/word/2006/wordml" xmlns:wps="http://schemas.microsoft.com/office/word/2010/wordprocessingShape" mc:Ignorable="w14 w15 w16se w16cid w16 w16cex w16sdtdh w16sdtfl w16du wp14">
   <w:p>
     <w:pPr>
@@ -1615,12 +794,6 @@
       </mc:AlternateContent>
     </w:r>
   </w:p>
-</w:hdr>
-</file>
-
-<file path=word/header3.xml><?xml version="1.0" encoding="utf-8"?>
-<w:hdr xmlns:wpc="http://schemas.microsoft.com/office/word/2010/wordprocessingCanvas" xmlns:cx="http://schemas.microsoft.com/office/drawing/2014/chartex" xmlns:cx1="http://schemas.microsoft.com/office/drawing/2015/9/8/chartex" xmlns:cx2="http://schemas.microsoft.com/office/drawing/2015/10/21/chartex" xmlns:cx3="http://schemas.microsoft.com/office/drawing/2016/5/9/chartex" xmlns:cx4="http://schemas.microsoft.com/office/drawing/2016/5/10/chartex" xmlns:cx5="http://schemas.microsoft.com/office/drawing/2016/5/11/chartex" xmlns:cx6="http://schemas.microsoft.com/office/drawing/2016/5/12/chartex" xmlns:cx7="http://schemas.microsoft.com/office/drawing/2016/5/13/chartex" xmlns:cx8="http://schemas.microsoft.com/office/drawing/2016/5/14/chartex" xmlns:mc="http://schemas.openxmlformats.org/markup-compatibility/2006" xmlns:aink="http://schemas.microsoft.com/office/drawing/2016/ink" xmlns:am3d="http://schemas.microsoft.com/office/drawing/2017/model3d" xmlns:o="urn:schemas-microsoft-com:office:office" xmlns:oel="http://schemas.microsoft.com/office/2019/extlst" xmlns:r="http://schemas.openxmlformats.org/officeDocument/2006/relationships" xmlns:m="http://schemas.openxmlformats.org/officeDocument/2006/math" xmlns:v="urn:schemas-microsoft-com:vml" xmlns:wp14="http://schemas.microsoft.com/office/word/2010/wordprocessingDrawing" xmlns:wp="http://schemas.openxmlformats.org/drawingml/2006/wordprocessingDrawing" xmlns:w10="urn:schemas-microsoft-com:office:word" xmlns:w="http://schemas.openxmlformats.org/wordprocessingml/2006/main" xmlns:w14="http://schemas.microsoft.com/office/word/2010/wordml" xmlns:w15="http://schemas.microsoft.com/office/word/2012/wordml" xmlns:w16cex="http://schemas.microsoft.com/office/word/2018/wordml/cex" xmlns:w16cid="http://schemas.microsoft.com/office/word/2016/wordml/cid" xmlns:w16="http://schemas.microsoft.com/office/word/2018/wordml" xmlns:w16du="http://schemas.microsoft.com/office/word/2023/wordml/word16du" xmlns:w16sdtdh="http://schemas.microsoft.com/office/word/2020/wordml/sdtdatahash" xmlns:w16sdtfl="http://schemas.microsoft.com/office/word/2024/wordml/sdtformatlock" xmlns:w16se="http://schemas.microsoft.com/office/word/2015/wordml/symex" xmlns:wpg="http://schemas.microsoft.com/office/word/2010/wordprocessingGroup" xmlns:wpi="http://schemas.microsoft.com/office/word/2010/wordprocessingInk" xmlns:wne="http://schemas.microsoft.com/office/word/2006/wordml" xmlns:wps="http://schemas.microsoft.com/office/word/2010/wordprocessingShape" mc:Ignorable="w14 w15 w16se w16cid w16 w16cex w16sdtdh w16sdtfl w16du wp14">
-  <w:p/>
 </w:hdr>
 </file>
 

</xml_diff>